<commit_message>
Set App Store category for submission review.
Add Health & Fitness LSApplicationCategoryType to the Xcode project and document primary/secondary categories in the submission materials.

Co-authored-by: Cursor <cursoragent@cursor.com>
</commit_message>
<xml_diff>
--- a/docs/app-store-submission-document.docx
+++ b/docs/app-store-submission-document.docx
@@ -742,6 +742,26 @@
                 <w:sz w:val="22"/>
               </w:rPr>
               <w:t>Full Access</w:t>
+            </w:r>
+          </w:p>
+          <w:p>
+            <w:r>
+              <w:t>Primary Category</w:t>
+            </w:r>
+          </w:p>
+          <w:p>
+            <w:r>
+              <w:t>Health &amp; Fitness</w:t>
+            </w:r>
+          </w:p>
+          <w:p>
+            <w:r>
+              <w:t>Secondary Category</w:t>
+            </w:r>
+          </w:p>
+          <w:p>
+            <w:r>
+              <w:t>Lifestyle</w:t>
             </w:r>
           </w:p>
         </w:tc>

</xml_diff>